<commit_message>
new files for lab 5
</commit_message>
<xml_diff>
--- a/labs/lab05/report/simulation-modeling-lab05-report.docx
+++ b/labs/lab05/report/simulation-modeling-lab05-report.docx
@@ -589,12 +589,12 @@
       <w:r>
         <w:t xml:space="preserve">) (</w:t>
       </w:r>
-      <w:hyperlink w:anchor="fig-008">
+      <w:hyperlink w:anchor="fig-007">
         <w:r>
           <w:rPr>
             <w:rStyle w:val="Hyperlink"/>
           </w:rPr>
-          <w:t xml:space="preserve">рис. 8</w:t>
+          <w:t xml:space="preserve">рис. 5</w:t>
         </w:r>
       </w:hyperlink>
       <w:r>
@@ -1879,62 +1879,6 @@
           <w:rStyle w:val="VerbatimChar"/>
         </w:rPr>
         <w:t xml:space="preserve">Deadlock обнаружен: false</w:t>
-      </w:r>
-    </w:p>
-    <w:p>
-      <w:pPr>
-        <w:pStyle w:val="SourceCode"/>
-      </w:pPr>
-      <w:r>
-        <w:rPr>
-          <w:rStyle w:val="VerbatimChar"/>
-        </w:rPr>
-        <w:t xml:space="preserve">WARNING: replacing module DiningPhilosophers.</w:t>
-      </w:r>
-      <w:r>
-        <w:br/>
-      </w:r>
-      <w:r>
-        <w:rPr>
-          <w:rStyle w:val="VerbatimChar"/>
-        </w:rPr>
-        <w:t xml:space="preserve">WARNING: using DiningPhilosophers.build_classical_network in module Main conflicts with an existing identifier.</w:t>
-      </w:r>
-      <w:r>
-        <w:br/>
-      </w:r>
-      <w:r>
-        <w:rPr>
-          <w:rStyle w:val="VerbatimChar"/>
-        </w:rPr>
-        <w:t xml:space="preserve">WARNING: using DiningPhilosophers.build_arbiter_network in module Main conflicts with an existing identifier.</w:t>
-      </w:r>
-      <w:r>
-        <w:br/>
-      </w:r>
-      <w:r>
-        <w:rPr>
-          <w:rStyle w:val="VerbatimChar"/>
-        </w:rPr>
-        <w:t xml:space="preserve">WARNING: using DiningPhilosophers.simulate_stochastic in module Main conflicts with an existing identifier.</w:t>
-      </w:r>
-      <w:r>
-        <w:br/>
-      </w:r>
-      <w:r>
-        <w:rPr>
-          <w:rStyle w:val="VerbatimChar"/>
-        </w:rPr>
-        <w:t xml:space="preserve">WARNING: using DiningPhilosophers.detect_deadlock in module Main conflicts with an existing identifier.</w:t>
-      </w:r>
-      <w:r>
-        <w:br/>
-      </w:r>
-      <w:r>
-        <w:rPr>
-          <w:rStyle w:val="VerbatimChar"/>
-        </w:rPr>
-        <w:t xml:space="preserve">WARNING: using DiningPhilosophers.plot_marking_evolution in module Main conflicts with an existing identifier.</w:t>
       </w:r>
     </w:p>
     <w:p>

</xml_diff>